<commit_message>
Switch all 5 markets to TradingView futures as primary source
- US: CBOT ZQ (unchanged), now uses EFFR/DFF from FRED as base rate
- EU: Eurex EURIBOR 3M (FEU3), DFR-anchored spread calibration
- UK: ICE 3M SONIA (SO3), BOE-rate-anchored; BOE OIS ZIP as fallback
- CA: TMX 3M CORRA (quarterly H/M/U/Z); BOC CORRA+2Y as fallback
- AU: ASX24 30-day IB cash rate (month+1 convention); RBA BABs fallback
- All fetchers return (rate, is_interp) tuples; CA non-quarterly meetings
  marked with ~ in the Implied Rate column
- Removed drift model fallback — no data shown when futures unavailable
- Cron updated to hourly; methodology doc updated to v2.1

Co-Authored-By: Claude Sonnet 4.6 <noreply@anthropic.com>
</commit_message>
<xml_diff>
--- a/WIRP_Methodology.docx
+++ b/WIRP_Methodology.docx
@@ -612,7 +612,7 @@
           <w:color w:val="1E293B"/>
           <w:sz w:val="19"/>
         </w:rPr>
-        <w:t>UK (MPC):  BOE SONIA OIS instantaneous forward curve (ZIP file, 60 monthly tenors).  Interpolated to each meeting date.</w:t>
+        <w:t>UK (MPC):  ICE 3-Month SONIA futures (ICEEUR:SO3{M}{YYYY}) via TradingView.  Same anchoring as ECB: spread = nearest_contract_SONIA − BOE Bank Rate.  Falls back to the BOE SONIA OIS instantaneous forward curve (daily ZIP, 60 tenors).</w:t>
       </w:r>
     </w:p>
     <w:p>
@@ -628,7 +628,7 @@
           <w:color w:val="1E293B"/>
           <w:sz w:val="19"/>
         </w:rPr>
-        <w:t>CA (BOC):  Two-point linear interpolation between BOC Valet API overnight CORRA and 2-year government benchmark bond yield.</w:t>
+        <w:t>CA (BOC):  TMX 3-Month CORRA futures (TMX:CRA{M}{YYYY}) via TradingView.  Quarterly contracts only (Mar/Jun/Sep/Dec).  Same spread-anchoring approach.  Falls back to BOC Valet CORRA overnight + 2Y government bond interpolation.  Meetings in non-quarterly months are interpolated between adjacent contracts and marked with "~" in the dashboard.</w:t>
       </w:r>
     </w:p>
     <w:p>
@@ -644,7 +644,7 @@
           <w:color w:val="1E293B"/>
           <w:sz w:val="19"/>
         </w:rPr>
-        <w:t>AU (RBA):  RBA F01 BABs/NCDs at 1M/3M/6M maturities, adjusted by a fixed BBSW-OIS spread.</w:t>
+        <w:t>AU (RBA):  ASX 30-day Interbank Cash Rate futures (ASX24:IB{M}{YYYY}) via TradingView.  Settlement = average RBA cash rate over the calendar month; month M+1 contract used for a meeting in month M (same convention as US ZQ).  No spread adjustment.  Falls back to RBA F01 BABs/NCDs with BBSW-OIS spread adjustment.</w:t>
       </w:r>
     </w:p>
     <w:p>
@@ -1275,7 +1275,23 @@
           <w:color w:val="1E293B"/>
           <w:sz w:val="19"/>
         </w:rPr>
-        <w:t>TradingView scanner API is an unofficial endpoint; availability and field names may change without notice.  Yahoo Finance (US) and ECB SDW YC (EU) are maintained as fallbacks.</w:t>
+        <w:t>TradingView scanner API is an unofficial endpoint; availability and field names may change without notice.  Yahoo Finance (US), BOE OIS ZIP (UK), BOC Valet (CA), and RBA F01 BABs (AU) are maintained as fallbacks for each market.</w:t>
+      </w:r>
+    </w:p>
+    <w:p>
+      <w:pPr>
+        <w:pStyle w:val="ListBullet"/>
+        <w:spacing w:before="0" w:after="40"/>
+        <w:ind w:left="227"/>
+      </w:pPr>
+      <w:r>
+        <w:rPr>
+          <w:b w:val="0"/>
+          <w:i w:val="0"/>
+          <w:color w:val="1E293B"/>
+          <w:sz w:val="19"/>
+        </w:rPr>
+        <w:t>CA implied rates between quarterly CORRA contract months are linearly interpolated; these meetings are marked with "~" in the Implied Rate column.</w:t>
       </w:r>
     </w:p>
     <w:p>

</xml_diff>

<commit_message>
Update methodology doc to v2.2
- Real historical pricing data sources (US yfinance, EU ECB SDW)
- bps precision note (4dp, tick-size limited)
- New Global tab section
- Removed simulated history note
- Renumbered sections

Co-Authored-By: Claude Sonnet 4.6 <noreply@anthropic.com>
</commit_message>
<xml_diff>
--- a/WIRP_Methodology.docx
+++ b/WIRP_Methodology.docx
@@ -681,6 +681,22 @@
     </w:p>
     <w:p>
       <w:pPr>
+        <w:pStyle w:val="ListBullet"/>
+        <w:spacing w:before="0" w:after="40"/>
+        <w:ind w:left="227"/>
+      </w:pPr>
+      <w:r>
+        <w:rPr>
+          <w:b w:val="0"/>
+          <w:i w:val="0"/>
+          <w:color w:val="1E293B"/>
+          <w:sz w:val="19"/>
+        </w:rPr>
+        <w:t>Precision:  Implied rates are stored to 4 decimal places; no rounding is applied to the bps display.  Practical granularity is limited by futures tick size (~0.5 bps for most markets).</w:t>
+      </w:r>
+    </w:p>
+    <w:p>
+      <w:pPr>
         <w:spacing w:before="0" w:after="120"/>
       </w:pPr>
       <w:r>
@@ -1011,7 +1027,7 @@
           <w:color w:val="1E293B"/>
           <w:sz w:val="19"/>
         </w:rPr>
-        <w:t>The repricing history chart shows how OIS-implied expectations for a specific future meeting have evolved over the preceding 12 months.  The methodology is as follows:</w:t>
+        <w:t>The pricing history chart shows how OIS- or futures-implied expectations for a specific future meeting have evolved over time, populated from real historical data (not simulation). Up to 3 years of meeting-specific implied rates are displayed for the selected meeting. An XLSX download of the full history is available from the chart panel. Historical data are sourced as follows:</w:t>
       </w:r>
     </w:p>
     <w:p>
@@ -1027,7 +1043,7 @@
           <w:color w:val="1E293B"/>
           <w:sz w:val="19"/>
         </w:rPr>
-        <w:t>For each month t going back up to 12 months, the estimated implied rate for meeting M is: Implied(t) = ImpliedToday + α × (SpotThen − SpotNow) + ε(t)</w:t>
+        <w:t>US (FOMC):  3-year backfill via yfinance ZQ futures price history.  Daily close prices are pulled for each relevant ZQ contract and converted to implied rates (100 − price).</w:t>
       </w:r>
     </w:p>
     <w:p>
@@ -1043,7 +1059,7 @@
           <w:color w:val="1E293B"/>
           <w:sz w:val="19"/>
         </w:rPr>
-        <w:t>SpotThen is estimated by reverse-extrapolating the current policy rate via the drift coefficient: SpotThen ≈ Spot − Drift × (t / 12) × 1.35</w:t>
+        <w:t>EU (ECB):  3-year backfill via the ECB Statistical Data Warehouse (SDW) AAA government bond yield curve, applying the same DFR-anchored EURIBOR-OIS spread methodology used for live data.</w:t>
       </w:r>
     </w:p>
     <w:p>
@@ -1059,20 +1075,29 @@
           <w:color w:val="1E293B"/>
           <w:sz w:val="19"/>
         </w:rPr>
-        <w:t>α = 0.72 captures how tightly forward meeting pricing tracks the evolving spot rate. ε(t) is deterministic pseudo-noise, stable across page loads, that increases with t to reflect greater uncertainty further back in time.</w:t>
+        <w:t>UK (MPC):  Bank of England IADB series IUMABEDR (effective rate) supplemented by OIS tenor data, providing a continuous historical implied rate series aligned with MPC meeting dates.</w:t>
       </w:r>
     </w:p>
     <w:p>
       <w:pPr>
-        <w:spacing w:before="0" w:after="120"/>
+        <w:pStyle w:val="ListBullet"/>
+        <w:spacing w:before="0" w:after="40"/>
+        <w:ind w:left="227"/>
       </w:pPr>
       <w:r>
         <w:rPr>
+          <w:b w:val="0"/>
+          <w:i w:val="0"/>
           <w:color w:val="1E293B"/>
           <w:sz w:val="19"/>
         </w:rPr>
-        <w:t>In production, this panel would be populated from a time-series database of daily OIS snapshots, showing the actual evolution of market pricing for each specific meeting date.</w:t>
+        <w:t>CA (BOC) and AU (RBA):  Historical implied rates are accumulated from hourly snapshots written by the live update pipeline, building a rolling time series over time.</w:t>
       </w:r>
+    </w:p>
+    <w:p>
+      <w:pPr>
+        <w:spacing w:after="120"/>
+      </w:pPr>
     </w:p>
     <w:p>
       <w:pPr>
@@ -1085,7 +1110,86 @@
           <w:color w:val="B45309"/>
           <w:sz w:val="17"/>
         </w:rPr>
-        <w:t>6.  DATA PIPELINE</w:t>
+        <w:t>6.  GLOBAL TAB — CROSS-MARKET COMPARISON</w:t>
+      </w:r>
+    </w:p>
+    <w:p>
+      <w:pPr>
+        <w:spacing w:before="0" w:after="80"/>
+      </w:pPr>
+      <w:r>
+        <w:rPr>
+          <w:color w:val="1E293B"/>
+          <w:sz w:val="19"/>
+        </w:rPr>
+        <w:t>The Global tab presents all five central bank implied rate paths on a single chart, enabling direct cross-market comparison of policy expectations:</w:t>
+      </w:r>
+    </w:p>
+    <w:p>
+      <w:pPr>
+        <w:pStyle w:val="ListBullet"/>
+        <w:spacing w:before="0" w:after="40"/>
+        <w:ind w:left="227"/>
+      </w:pPr>
+      <w:r>
+        <w:rPr>
+          <w:b w:val="0"/>
+          <w:i w:val="0"/>
+          <w:color w:val="1E293B"/>
+          <w:sz w:val="19"/>
+        </w:rPr>
+        <w:t>Each market's implied rate path is shown as bps relative to its current policy rate (y-axis), plotted against a time-based x-axis aligned to meeting dates.</w:t>
+      </w:r>
+    </w:p>
+    <w:p>
+      <w:pPr>
+        <w:pStyle w:val="ListBullet"/>
+        <w:spacing w:before="0" w:after="40"/>
+        <w:ind w:left="227"/>
+      </w:pPr>
+      <w:r>
+        <w:rPr>
+          <w:b w:val="0"/>
+          <w:i w:val="0"/>
+          <w:color w:val="1E293B"/>
+          <w:sz w:val="19"/>
+        </w:rPr>
+        <w:t>Clicking a central bank card highlights that market's line on the chart; all five markets remain visible simultaneously for overlay comparison.</w:t>
+      </w:r>
+    </w:p>
+    <w:p>
+      <w:pPr>
+        <w:pStyle w:val="ListBullet"/>
+        <w:spacing w:before="0" w:after="40"/>
+        <w:ind w:left="227"/>
+      </w:pPr>
+      <w:r>
+        <w:rPr>
+          <w:b w:val="0"/>
+          <w:i w:val="0"/>
+          <w:color w:val="1E293B"/>
+          <w:sz w:val="19"/>
+        </w:rPr>
+        <w:t>The chart uses the same underlying implied rate data as the individual market tabs — no additional calculations are performed.</w:t>
+      </w:r>
+    </w:p>
+    <w:p>
+      <w:pPr>
+        <w:spacing w:after="80"/>
+      </w:pPr>
+    </w:p>
+    <w:p>
+      <w:pPr>
+        <w:spacing w:before="160" w:after="60"/>
+      </w:pPr>
+      <w:r>
+        <w:rPr>
+          <w:b/>
+          <w:i w:val="0"/>
+          <w:color w:val="B45309"/>
+          <w:sz w:val="17"/>
+        </w:rPr>
+        <w:t>7.  DATA PIPELINE</w:t>
       </w:r>
     </w:p>
     <w:p>
@@ -1179,7 +1283,7 @@
           <w:color w:val="B45309"/>
           <w:sz w:val="17"/>
         </w:rPr>
-        <w:t>7.  LIMITATIONS &amp; ASSUMPTIONS</w:t>
+        <w:t>8.  LIMITATIONS &amp; ASSUMPTIONS</w:t>
       </w:r>
     </w:p>
     <w:p>
@@ -1339,7 +1443,23 @@
           <w:color w:val="1E293B"/>
           <w:sz w:val="19"/>
         </w:rPr>
-        <w:t>Historical repricing series are simulated; they are illustrative and not based on live OIS time-series data.</w:t>
+        <w:t>CA and AU historical pricing depth grows over time as hourly snapshots accumulate; full 3-year backfill is not available for those markets at initial deployment.</w:t>
+      </w:r>
+    </w:p>
+    <w:p>
+      <w:pPr>
+        <w:pStyle w:val="ListBullet"/>
+        <w:spacing w:before="0" w:after="40"/>
+        <w:ind w:left="227"/>
+      </w:pPr>
+      <w:r>
+        <w:rPr>
+          <w:b w:val="0"/>
+          <w:i w:val="0"/>
+          <w:color w:val="1E293B"/>
+          <w:sz w:val="19"/>
+        </w:rPr>
+        <w:t>Historical pricing data for US and EU extends up to 3 years via ZQ futures (yfinance) and ECB SDW yield curve respectively; earlier data may be unavailable for some meeting dates.</w:t>
       </w:r>
     </w:p>
     <w:p/>
@@ -1357,7 +1477,7 @@
           <w:color w:val="475669"/>
           <w:sz w:val="15"/>
         </w:rPr>
-        <w:t>WIRP v2.1  ·  For internal research use only  ·  OIS / Futures-implied estimates; not investment advice</w:t>
+        <w:t>WIRP v2.2  ·  For internal research use only  ·  OIS / Futures-implied estimates; not investment advice</w:t>
       </w:r>
     </w:p>
     <w:sectPr>

</xml_diff>